<commit_message>
build(dist): regenerate P3/P4/P5 submission deliverables with reframing
Rebuild DOCX/TEX/PDF (EN + VN) for P3 (APJM), P4 (MIR), P5 (APJM) from the reframed
manuscripts/ build sources via scripts/build_submission_package.sh. Deliverables now
carry the Export Cliff (P3), fixed-cost amortization + scale lubricant (P4), and
survival-constant (P5) framing. Verified labels present in the built DOCX.

https://claude.ai/code/session_01TNqoRFY1vAVQL6GWg8X9M3
</commit_message>
<xml_diff>
--- a/dist/submission/p3_vietnam_APJM.docx
+++ b/dist/submission/p3_vietnam_APJM.docx
@@ -146,7 +146,7 @@
         <w:t xml:space="preserve"> </w:t>
       </w:r>
       <w:r>
-        <w:t xml:space="preserve">market and examines how technological capability and foundational digital adoption are associated with firms' productivity under conditions of institutional and digital transition. Focusing</w:t>
+        <w:t xml:space="preserve">market and traces how technological capability and foundational digital adoption relate to firms' productivity under conditions of institutional and digital transition. Focusing</w:t>
       </w:r>
       <w:r>
         <w:t xml:space="preserve"> </w:t>
@@ -214,19 +214,13 @@
         <w:t xml:space="preserve"> </w:t>
       </w:r>
       <w:r>
-        <w:t xml:space="preserve">foreign-technology / standards capability from foundational digital adoption and by showing</w:t>
-      </w:r>
-      <w:r>
-        <w:t xml:space="preserve"> </w:t>
-      </w:r>
-      <w:r>
-        <w:t xml:space="preserve">that pooled digital effects can mask substantial temporal heterogeneity. The findings suggest</w:t>
-      </w:r>
-      <w:r>
-        <w:t xml:space="preserve"> </w:t>
-      </w:r>
-      <w:r>
-        <w:t xml:space="preserve">that the productivity relevance of basic digital adoption is context-sensitive and wave-specific</w:t>
+        <w:t xml:space="preserve">foreign-technology / standards capability from foundational digital adoption and by showing how</w:t>
+      </w:r>
+      <w:r>
+        <w:t xml:space="preserve"> </w:t>
+      </w:r>
+      <w:r>
+        <w:t xml:space="preserve">pooled digital effects can mask substantial temporal heterogeneity. On this evidence, the productivity relevance of basic digital adoption is context-sensitive and wave-specific</w:t>
       </w:r>
       <w:r>
         <w:t xml:space="preserve"> </w:t>
@@ -651,19 +645,13 @@
         <w:pStyle w:val="BodyText"/>
       </w:pPr>
       <w:r>
-        <w:t xml:space="preserve">internationalisation should not be assumed to generate a simple linear performance premium.</w:t>
-      </w:r>
-      <w:r>
-        <w:t xml:space="preserve"> </w:t>
-      </w:r>
-      <w:r>
-        <w:t xml:space="preserve">Firms may gain access to larger markets, benefit from learning, and diversify revenue streams,</w:t>
-      </w:r>
-      <w:r>
-        <w:t xml:space="preserve"> </w:t>
-      </w:r>
-      <w:r>
-        <w:t xml:space="preserve">but they may also face rising coordination costs, information-processing burdens, and organisational strain as their foreign involvement deepens (Wright et al., 2005; Cuervo-Cazurra and</w:t>
+        <w:t xml:space="preserve">internationalisation does not lend itself to the assumption of a simple linear performance premium.</w:t>
+      </w:r>
+      <w:r>
+        <w:t xml:space="preserve"> </w:t>
+      </w:r>
+      <w:r>
+        <w:t xml:space="preserve">Foreign involvement opens access to larger markets, learning, and diversified revenue, yet it also brings rising coordination costs, heavier information-processing burdens, and organisational strain as that involvement deepens (Wright et al., 2005; Cuervo-Cazurra and</w:t>
       </w:r>
       <w:r>
         <w:t xml:space="preserve"> </w:t>
@@ -675,31 +663,13 @@
         <w:t xml:space="preserve"> </w:t>
       </w:r>
       <w:r>
-        <w:t xml:space="preserve">This tension lies at the heart of the I–P literature. A long tradition of research has argued</w:t>
-      </w:r>
-      <w:r>
-        <w:t xml:space="preserve"> </w:t>
-      </w:r>
-      <w:r>
-        <w:t xml:space="preserve">that internationalisation can improve performance at lower and intermediate levels through scale,</w:t>
-      </w:r>
-      <w:r>
-        <w:t xml:space="preserve"> </w:t>
-      </w:r>
-      <w:r>
-        <w:t xml:space="preserve">learning, and diversification, while also generating diminishing or negative returns at higher levels</w:t>
-      </w:r>
-      <w:r>
-        <w:t xml:space="preserve"> </w:t>
-      </w:r>
-      <w:r>
-        <w:t xml:space="preserve">because of complexity and coordination burdens. Meta-analytic evidence strongly supports the</w:t>
-      </w:r>
-      <w:r>
-        <w:t xml:space="preserve"> </w:t>
-      </w:r>
-      <w:r>
-        <w:t xml:space="preserve">view that nonlinearity is a central feature of this relationship rather than an empirical anomaly</w:t>
+        <w:t xml:space="preserve">This tension lies at the heart of the I–P literature. A long tradition of work holds that internationalisation improves performance at lower and intermediate levels through scale,</w:t>
+      </w:r>
+      <w:r>
+        <w:t xml:space="preserve"> </w:t>
+      </w:r>
+      <w:r>
+        <w:t xml:space="preserve">learning, and diversification, while complexity and coordination burdens drag returns toward zero or below them at higher levels. Meta-analytic evidence indicates that this nonlinearity is a central feature of the relationship, not an empirical anomaly</w:t>
       </w:r>
       <w:r>
         <w:t xml:space="preserve"> </w:t>
@@ -711,7 +681,7 @@
         <w:t xml:space="preserve"> </w:t>
       </w:r>
       <w:r>
-        <w:t xml:space="preserve">Digitalisation adds a further layer of complexity to this debate.</w:t>
+        <w:t xml:space="preserve">Digitalisation layers a further complication onto this debate.</w:t>
       </w:r>
     </w:p>
     <w:p>
@@ -727,19 +697,13 @@
         <w:pStyle w:val="BodyText"/>
       </w:pPr>
       <w:r>
-        <w:t xml:space="preserve">communication frictions, accelerate transactions, and support coordination across borders. Yet</w:t>
-      </w:r>
-      <w:r>
-        <w:t xml:space="preserve"> </w:t>
-      </w:r>
-      <w:r>
-        <w:t xml:space="preserve">those benefits do not arise automatically. Their realised value depends on whether firms possess</w:t>
-      </w:r>
-      <w:r>
-        <w:t xml:space="preserve"> </w:t>
-      </w:r>
-      <w:r>
-        <w:t xml:space="preserve">the organisational depth, absorptive capacity, and complementary routines needed to translate</w:t>
+        <w:t xml:space="preserve">communication frictions, speed transactions, and support cross-border coordination, but the benefits do not arrive automatically. Their realised value depends on whether a firm holds</w:t>
+      </w:r>
+      <w:r>
+        <w:t xml:space="preserve"> </w:t>
+      </w:r>
+      <w:r>
+        <w:t xml:space="preserve">the organisational depth, absorptive capacity, and complementary routines needed to convert</w:t>
       </w:r>
       <w:r>
         <w:t xml:space="preserve"> </w:t>
@@ -751,7 +715,7 @@
         <w:t xml:space="preserve"> </w:t>
       </w:r>
       <w:r>
-        <w:t xml:space="preserve">2021; Stallkamp and Schotter, 2021; Petricevic and Teece, 2019). For this reason, digital capability should not be treated as a universally beneficial resource whose payoff is constant across</w:t>
+        <w:t xml:space="preserve">2021; Stallkamp and Schotter, 2021; Petricevic and Teece, 2019). Digital capability, then, is poorly described as a universally beneficial resource whose payoff stays constant across</w:t>
       </w:r>
       <w:r>
         <w:t xml:space="preserve"> </w:t>
@@ -763,31 +727,25 @@
         <w:t xml:space="preserve"> </w:t>
       </w:r>
       <w:r>
-        <w:t xml:space="preserve">The Vietnamese setting makes this issue especially important. Because firms are embedded</w:t>
-      </w:r>
-      <w:r>
-        <w:t xml:space="preserve"> </w:t>
-      </w:r>
-      <w:r>
-        <w:t xml:space="preserve">in an economy undergoing capability upgrading and digital transition, both the benefits of</w:t>
-      </w:r>
-      <w:r>
-        <w:t xml:space="preserve"> </w:t>
-      </w:r>
-      <w:r>
-        <w:t xml:space="preserve">internationalisation and the payoff from digitalisation may vary across stages of development.</w:t>
-      </w:r>
-      <w:r>
-        <w:t xml:space="preserve"> </w:t>
-      </w:r>
-      <w:r>
-        <w:t xml:space="preserve">This raises a central question for the present study: does digital capability in Vietnam function</w:t>
-      </w:r>
-      <w:r>
-        <w:t xml:space="preserve"> </w:t>
-      </w:r>
-      <w:r>
-        <w:t xml:space="preserve">as a stable performance-enhancing asset, or does it operate as a stage-contingent resource whose</w:t>
+        <w:t xml:space="preserve">The Vietnamese setting makes this issue especially pointed. Firms here are embedded</w:t>
+      </w:r>
+      <w:r>
+        <w:t xml:space="preserve"> </w:t>
+      </w:r>
+      <w:r>
+        <w:t xml:space="preserve">in an economy that is upgrading capability and passing through digital transition at the same time, so both the gains from</w:t>
+      </w:r>
+      <w:r>
+        <w:t xml:space="preserve"> </w:t>
+      </w:r>
+      <w:r>
+        <w:t xml:space="preserve">internationalisation and the payoff from digitalisation may shift across stages of development. The central question for this study follows directly: does digital capability in Vietnam behave</w:t>
+      </w:r>
+      <w:r>
+        <w:t xml:space="preserve"> </w:t>
+      </w:r>
+      <w:r>
+        <w:t xml:space="preserve">as a stable performance-enhancing asset, or as a stage-contingent resource whose</w:t>
       </w:r>
       <w:r>
         <w:t xml:space="preserve"> </w:t>
@@ -867,31 +825,31 @@
         <w:t xml:space="preserve"> </w:t>
       </w:r>
       <w:r>
-        <w:t xml:space="preserve">These shifts are not cosmetic. The composition of the exporter cohort itself evolves across</w:t>
-      </w:r>
-      <w:r>
-        <w:t xml:space="preserve"> </w:t>
-      </w:r>
-      <w:r>
-        <w:t xml:space="preserve">the three waves: the share of firms reporting any positive direct-export intensity declines as</w:t>
-      </w:r>
-      <w:r>
-        <w:t xml:space="preserve"> </w:t>
-      </w:r>
-      <w:r>
-        <w:t xml:space="preserve">services and FDI-linked supply-chain firms enter the sample, while the average level of foundational digital adoption rises with the diffusion of websites, electronic payment systems, and</w:t>
-      </w:r>
-      <w:r>
-        <w:t xml:space="preserve"> </w:t>
-      </w:r>
-      <w:r>
-        <w:t xml:space="preserve">digital transaction interfaces. Reading the I–P relationship and the digital-adoption channel as</w:t>
-      </w:r>
-      <w:r>
-        <w:t xml:space="preserve"> </w:t>
-      </w:r>
-      <w:r>
-        <w:t xml:space="preserve">fixed structural facts across this fourteen-year window misses the fact that the underlying firm</w:t>
+        <w:t xml:space="preserve">These shifts are not cosmetic. The exporter cohort itself changes composition across</w:t>
+      </w:r>
+      <w:r>
+        <w:t xml:space="preserve"> </w:t>
+      </w:r>
+      <w:r>
+        <w:t xml:space="preserve">the three waves: the share of firms reporting any positive direct-export intensity falls as</w:t>
+      </w:r>
+      <w:r>
+        <w:t xml:space="preserve"> </w:t>
+      </w:r>
+      <w:r>
+        <w:t xml:space="preserve">services and FDI-linked supply-chain firms enter the sample, while average foundational digital adoption rises with the diffusion of websites, electronic payment systems, and</w:t>
+      </w:r>
+      <w:r>
+        <w:t xml:space="preserve"> </w:t>
+      </w:r>
+      <w:r>
+        <w:t xml:space="preserve">digital transaction interfaces. To read the I–P relationship and the digital-adoption channel as</w:t>
+      </w:r>
+      <w:r>
+        <w:t xml:space="preserve"> </w:t>
+      </w:r>
+      <w:r>
+        <w:t xml:space="preserve">fixed structural facts across this fourteen-year window is to miss that the underlying firm</w:t>
       </w:r>
       <w:r>
         <w:t xml:space="preserve"> </w:t>
@@ -921,7 +879,7 @@
         <w:pStyle w:val="FirstParagraph"/>
       </w:pPr>
       <w:r>
-        <w:t xml:space="preserve">Three gaps motivate this study.</w:t>
+        <w:t xml:space="preserve">This study addresses three gaps that remain unresolved in the existing literature.</w:t>
       </w:r>
     </w:p>
     <w:p>
@@ -929,7 +887,7 @@
         <w:pStyle w:val="BodyText"/>
       </w:pPr>
       <w:r>
-        <w:t xml:space="preserve">First, existing work often treats digitalisation as a broadly</w:t>
+        <w:t xml:space="preserve">One gap concerns how digitalisation is theorised. Much existing work treats it as a broadly positive resource and pays little attention to temporal and contextual variation in its payoff. That treatment risks implying a relatively stable performance premium across firms and across stages of economic transition (Strange and Zucchella, 2017; Goldfarb and Tucker, 2019). The returns are more likely to be uneven, since firms differ in scale, routines, and complementary capability.</w:t>
       </w:r>
     </w:p>
     <w:p>
@@ -937,97 +895,15 @@
         <w:pStyle w:val="BodyText"/>
       </w:pPr>
       <w:r>
-        <w:t xml:space="preserve">positive resource without paying sufficient attention to temporal and contextual variation in its</w:t>
-      </w:r>
-      <w:r>
-        <w:t xml:space="preserve"> </w:t>
-      </w:r>
-      <w:r>
-        <w:t xml:space="preserve">payoff. Such a treatment risks implying that digital adoption produces a relatively stable performance premium across firms and across stages of economic transition (Strange and Zucchella,</w:t>
-      </w:r>
-      <w:r>
-        <w:t xml:space="preserve"> </w:t>
-      </w:r>
-      <w:r>
-        <w:t xml:space="preserve">2017; Goldfarb and Tucker, 2019). In reality, digitalisation may generate uneven returns because</w:t>
-      </w:r>
-      <w:r>
-        <w:t xml:space="preserve"> </w:t>
-      </w:r>
-      <w:r>
-        <w:t xml:space="preserve">firms differ in scale, routines, and complementary capability.</w:t>
-      </w:r>
-      <w:r>
-        <w:t xml:space="preserve"> </w:t>
-      </w:r>
-      <w:r>
-        <w:t xml:space="preserve">Second, the distinction between technological capability and digital adoption remains underdeveloped. Technological capability refers to deeper firm-internal stocks of learning, problemsolving, process improvement, and innovation capacity (Lall, 1992). Foundational digital adoption, by contrast, reflects a more basic layer of digital readiness and digitally enabled interfaces</w:t>
-      </w:r>
-      <w:r>
-        <w:t xml:space="preserve"> </w:t>
-      </w:r>
-      <w:r>
-        <w:t xml:space="preserve">or transaction mechanisms (Bharadwaj et al., 2013; Verhoef et al., 2021; Hanelt et al., 2021;</w:t>
-      </w:r>
-      <w:r>
-        <w:t xml:space="preserve"> </w:t>
-      </w:r>
-      <w:r>
-        <w:t xml:space="preserve">Brouthers et al., 2016). Although these constructs are related, they should not be treated as</w:t>
-      </w:r>
-      <w:r>
-        <w:t xml:space="preserve"> </w:t>
-      </w:r>
-      <w:r>
-        <w:t xml:space="preserve">interchangeable. Collapsing them into a single umbrella variable can reduce construct clarity</w:t>
-      </w:r>
-      <w:r>
-        <w:t xml:space="preserve"> </w:t>
-      </w:r>
-      <w:r>
-        <w:t xml:space="preserve">and blur the mechanisms linking digitalisation to performance.</w:t>
-      </w:r>
-      <w:r>
-        <w:t xml:space="preserve"> </w:t>
-      </w:r>
-      <w:r>
-        <w:t xml:space="preserve">Third, pooled estimates may obscure substantial lifecycle heterogeneity. In a setting such</w:t>
-      </w:r>
-      <w:r>
-        <w:t xml:space="preserve"> </w:t>
-      </w:r>
-      <w:r>
-        <w:t xml:space="preserve">as Vietnam, where firms and institutions pass through distinct stages of transition, the role of</w:t>
-      </w:r>
-      <w:r>
-        <w:t xml:space="preserve"> </w:t>
-      </w:r>
-      <w:r>
-        <w:t xml:space="preserve">internationalisation, technological capability, and digital adoption may vary considerably across</w:t>
-      </w:r>
-      <w:r>
-        <w:t xml:space="preserve"> </w:t>
-      </w:r>
-      <w:r>
-        <w:t xml:space="preserve">survey waves. A pooled model is useful for identifying average effects, but it is insufficient if</w:t>
-      </w:r>
-      <w:r>
-        <w:t xml:space="preserve"> </w:t>
-      </w:r>
-      <w:r>
-        <w:t xml:space="preserve">the underlying relationships shift across time. A design that combines pooled and wave-specific</w:t>
-      </w:r>
-      <w:r>
-        <w:t xml:space="preserve"> </w:t>
-      </w:r>
-      <w:r>
-        <w:t xml:space="preserve">analysis is therefore necessary to determine whether the observed effects are stable or stage</w:t>
-      </w:r>
-      <w:r>
-        <w:t xml:space="preserve"> </w:t>
-      </w:r>
-      <w:r>
-        <w:t xml:space="preserve">contingent.</w:t>
+        <w:t xml:space="preserve">A second gap concerns construct clarity. The distinction between technological capability and digital adoption remains underdeveloped. Technological capability refers to deeper firm-internal stocks of learning, problem-solving, process improvement, and innovation capacity (Lall, 1992); foundational digital adoption reflects a more basic layer of digital readiness and digitally enabled interfaces or transaction mechanisms (Bharadwaj et al., 2013; Verhoef et al., 2021; Hanelt et al., 2021; Brouthers et al., 2016). The two are related, but treating them as interchangeable, and collapsing them into a single umbrella variable, blurs the mechanisms that link digitalisation to performance.</w:t>
+      </w:r>
+    </w:p>
+    <w:p>
+      <w:pPr>
+        <w:pStyle w:val="BodyText"/>
+      </w:pPr>
+      <w:r>
+        <w:t xml:space="preserve">The remaining gap is methodological. Pooled estimates can obscure substantial lifecycle heterogeneity. Where firms and institutions pass through distinct stages of transition, as in Vietnam, the roles of internationalisation, technological capability, and digital adoption may vary considerably across survey waves. A pooled model identifies average effects well enough, but it falls short once the underlying relationships shift over time. A design that combines pooled and wave-specific analysis is therefore needed to determine whether the observed effects are stable or stage contingent.</w:t>
       </w:r>
     </w:p>
     <w:p>
@@ -1053,7 +929,7 @@
         <w:pStyle w:val="FirstParagraph"/>
       </w:pPr>
       <w:r>
-        <w:t xml:space="preserve">This study makes three contributions to the literature.</w:t>
+        <w:t xml:space="preserve">This study makes four contributions to the literature.</w:t>
       </w:r>
     </w:p>
     <w:p>
@@ -1061,7 +937,7 @@
         <w:pStyle w:val="BodyText"/>
       </w:pPr>
       <w:r>
-        <w:t xml:space="preserve">First, it refines the I–P debate by</w:t>
+        <w:t xml:space="preserve">It first refines the I–P debate. The Vietnamese evidence supports a nonlinear relationship, but the salience and visibility of that relationship vary across time. Nonlinearity, on this reading, is not a fixed structural fact that appears identically in every period; the I–P curve has to be read alongside the broader capability environment.</w:t>
       </w:r>
     </w:p>
     <w:p>
@@ -1069,43 +945,7 @@
         <w:pStyle w:val="BodyText"/>
       </w:pPr>
       <w:r>
-        <w:t xml:space="preserve">showing that the Vietnamese evidence supports a nonlinear relationship, but that the salience</w:t>
-      </w:r>
-      <w:r>
-        <w:t xml:space="preserve"> </w:t>
-      </w:r>
-      <w:r>
-        <w:t xml:space="preserve">and visibility of that relationship vary across time. Rather than treating nonlinearity as a fixed</w:t>
-      </w:r>
-      <w:r>
-        <w:t xml:space="preserve"> </w:t>
-      </w:r>
-      <w:r>
-        <w:t xml:space="preserve">structural fact that appears identically in every period, the analysis shows that the I–P curve</w:t>
-      </w:r>
-      <w:r>
-        <w:t xml:space="preserve"> </w:t>
-      </w:r>
-      <w:r>
-        <w:t xml:space="preserve">must be read in conjunction with the broader capability environment.</w:t>
-      </w:r>
-      <w:r>
-        <w:t xml:space="preserve"> </w:t>
-      </w:r>
-      <w:r>
-        <w:t xml:space="preserve">Second, the study improves construct validity by separating technological capability from</w:t>
-      </w:r>
-      <w:r>
-        <w:t xml:space="preserve"> </w:t>
-      </w:r>
-      <w:r>
-        <w:t xml:space="preserve">foundational digital adoption. This distinction matters theoretically because deeper capability</w:t>
-      </w:r>
-      <w:r>
-        <w:t xml:space="preserve"> </w:t>
-      </w:r>
-      <w:r>
-        <w:t xml:space="preserve">stocks and basic digital enablement may generate performance through different channels.</w:t>
+        <w:t xml:space="preserve">The study also improves construct validity by separating technological capability from foundational digital adoption. The distinction matters theoretically, because deeper capability stocks and basic digital enablement may drive performance through different channels, and empirically, because the two constructs do not trace identical patterns across the Vietnamese waves.</w:t>
       </w:r>
     </w:p>
     <w:p>
@@ -1113,7 +953,7 @@
         <w:pStyle w:val="BodyText"/>
       </w:pPr>
       <w:r>
-        <w:t xml:space="preserve">It</w:t>
+        <w:t xml:space="preserve">A further contribution is a lifecycle reading of digital internationalisation. The evidence points to digital capability as neither a universally stable premium nor a uniformly ineffective resource; it is an uneven, stage-dependent source of performance heterogeneity — which helps explain how pooled average effects coexist with substantial wave-specific differences.</w:t>
       </w:r>
     </w:p>
     <w:p>
@@ -1121,55 +961,23 @@
         <w:pStyle w:val="BodyText"/>
       </w:pPr>
       <w:r>
-        <w:t xml:space="preserve">also matters empirically because the two constructs do not exhibit identical patterns across the</w:t>
-      </w:r>
-      <w:r>
-        <w:t xml:space="preserve"> </w:t>
-      </w:r>
-      <w:r>
-        <w:t xml:space="preserve">Vietnamese waves.</w:t>
-      </w:r>
-      <w:r>
-        <w:t xml:space="preserve"> </w:t>
-      </w:r>
-      <w:r>
-        <w:t xml:space="preserve">Third, the study introduces a lifecycle interpretation of digital internationalisation.</w:t>
-      </w:r>
-    </w:p>
-    <w:p>
-      <w:pPr>
-        <w:pStyle w:val="BodyText"/>
-      </w:pPr>
-      <w:r>
-        <w:t xml:space="preserve">The</w:t>
-      </w:r>
-    </w:p>
-    <w:p>
-      <w:pPr>
-        <w:pStyle w:val="BodyText"/>
-      </w:pPr>
-      <w:r>
-        <w:t xml:space="preserve">evidence suggests that digital capability is neither a universally stable premium nor a uniformly</w:t>
-      </w:r>
-      <w:r>
-        <w:t xml:space="preserve"> </w:t>
-      </w:r>
-      <w:r>
-        <w:t xml:space="preserve">ineffective resource. Instead, it is an uneven and stage-dependent source of performance heterogeneity. This perspective helps explain why pooled average effects may coexist with substantial</w:t>
-      </w:r>
-      <w:r>
-        <w:t xml:space="preserve"> </w:t>
-      </w:r>
-      <w:r>
-        <w:t xml:space="preserve">wave-specific differences.</w:t>
-      </w:r>
-    </w:p>
-    <w:p>
-      <w:pPr>
-        <w:pStyle w:val="BodyText"/>
-      </w:pPr>
-      <w:r>
-        <w:t xml:space="preserve">A fourth contribution is contextual: Vietnam's empirical pattern provides a participation-and-intensity decomposition showing that the robustly identified inverted-U (turning point 39–46 % FSTS) is driven primarily by the participation margin: within the exporter subsample, intensity variation yields flat to diminishing returns (Panel H), qualifying the conventional reading of the inverted-U pattern. The divergence between this pattern and those documented in digitally advanced economies, where the coordination-cost mechanism is attenuated by comprehensive digital infrastructure, points toward institution-level mechanisms as candidate moderators of I–P curve location. This within-context evidence anchors the digitally transitional end of the institutional spectrum.</w:t>
+        <w:t xml:space="preserve">A final, contextual contribution is that Vietnam's empirical pattern provides a participation-and-intensity decomposition showing that the robustly identified inverted-U (turning point 39–46 % FSTS) is driven primarily by the participation margin — an</w:t>
+      </w:r>
+      <w:r>
+        <w:t xml:space="preserve"> </w:t>
+      </w:r>
+      <w:r>
+        <w:rPr>
+          <w:iCs/>
+          <w:i/>
+        </w:rPr>
+        <w:t xml:space="preserve">Export Cliff Effect</w:t>
+      </w:r>
+      <w:r>
+        <w:t xml:space="preserve"> </w:t>
+      </w:r>
+      <w:r>
+        <w:t xml:space="preserve">at the export-entry threshold: within the exporter subsample, intensity variation yields flat to diminishing returns (Panel H), qualifying the conventional reading of the inverted-U pattern. The divergence between this pattern and those documented in digitally advanced economies, where the coordination-cost mechanism is attenuated by comprehensive digital infrastructure, points toward institution-level mechanisms as candidate moderators of I–P curve location. This within-context evidence anchors the digitally transitional end of the institutional spectrum.</w:t>
       </w:r>
     </w:p>
     <w:bookmarkEnd w:id="24"/>
@@ -1187,43 +995,7 @@
         <w:pStyle w:val="FirstParagraph"/>
       </w:pPr>
       <w:r>
-        <w:t xml:space="preserve">The remainder of the paper is organised as follows. Section 2 develops the theoretical framework</w:t>
-      </w:r>
-      <w:r>
-        <w:t xml:space="preserve"> </w:t>
-      </w:r>
-      <w:r>
-        <w:t xml:space="preserve">and hypotheses.</w:t>
-      </w:r>
-    </w:p>
-    <w:p>
-      <w:pPr>
-        <w:pStyle w:val="BodyText"/>
-      </w:pPr>
-      <w:r>
-        <w:t xml:space="preserve">Section 3 describes the data, variables, and empirical strategy.</w:t>
-      </w:r>
-    </w:p>
-    <w:p>
-      <w:pPr>
-        <w:pStyle w:val="BodyText"/>
-      </w:pPr>
-      <w:r>
-        <w:t xml:space="preserve">Section 4</w:t>
-      </w:r>
-    </w:p>
-    <w:p>
-      <w:pPr>
-        <w:pStyle w:val="BodyText"/>
-      </w:pPr>
-      <w:r>
-        <w:t xml:space="preserve">presents the results. Section 5 discusses the theoretical and managerial implications. Section 6</w:t>
-      </w:r>
-      <w:r>
-        <w:t xml:space="preserve"> </w:t>
-      </w:r>
-      <w:r>
-        <w:t xml:space="preserve">concludes.</w:t>
+        <w:t xml:space="preserve">The remainder of the paper is organised as follows. Section 2 develops the theoretical framework and hypotheses, and Section 3 describes the data, variables, and empirical strategy. Section 4 presents the results, Section 5 discusses the theoretical and managerial implications, and Section 6 concludes.</w:t>
       </w:r>
     </w:p>
     <w:bookmarkEnd w:id="25"/>
@@ -1251,25 +1023,19 @@
         <w:pStyle w:val="FirstParagraph"/>
       </w:pPr>
       <w:r>
-        <w:t xml:space="preserve">The relationship between internationalisation and firm performance is unlikely to be linear in</w:t>
-      </w:r>
-      <w:r>
-        <w:t xml:space="preserve"> </w:t>
-      </w:r>
-      <w:r>
-        <w:t xml:space="preserve">a transitional economy such as Vietnam. Foreign expansion can improve performance through</w:t>
-      </w:r>
-      <w:r>
-        <w:t xml:space="preserve"> </w:t>
-      </w:r>
-      <w:r>
-        <w:t xml:space="preserve">greater market reach, diversification, and learning from external environments. Firms may use</w:t>
-      </w:r>
-      <w:r>
-        <w:t xml:space="preserve"> </w:t>
-      </w:r>
-      <w:r>
-        <w:t xml:space="preserve">internationalisation to spread fixed costs, access new customers, and acquire knowledge that</w:t>
+        <w:t xml:space="preserve">In a transitional economy such as Vietnam, the relationship between internationalisation and firm performance is unlikely to be linear. Foreign expansion can lift performance through</w:t>
+      </w:r>
+      <w:r>
+        <w:t xml:space="preserve"> </w:t>
+      </w:r>
+      <w:r>
+        <w:t xml:space="preserve">greater market reach, diversification, and learning from external environments; firms use</w:t>
+      </w:r>
+      <w:r>
+        <w:t xml:space="preserve"> </w:t>
+      </w:r>
+      <w:r>
+        <w:t xml:space="preserve">internationalisation to spread fixed costs, reach new customers, and acquire knowledge that</w:t>
       </w:r>
       <w:r>
         <w:t xml:space="preserve"> </w:t>
@@ -1281,19 +1047,19 @@
         <w:t xml:space="preserve"> </w:t>
       </w:r>
       <w:r>
-        <w:t xml:space="preserve">At the same time, deeper international involvement often generates coordination costs and</w:t>
-      </w:r>
-      <w:r>
-        <w:t xml:space="preserve"> </w:t>
-      </w:r>
-      <w:r>
-        <w:t xml:space="preserve">organisational burdens. Firms must manage multiple markets, reconcile diverse customer demands, process more information, and sustain greater managerial control. As foreign expansion</w:t>
-      </w:r>
-      <w:r>
-        <w:t xml:space="preserve"> </w:t>
-      </w:r>
-      <w:r>
-        <w:t xml:space="preserve">intensifies, these costs may grow faster than the benefits, producing diminishing returns or</w:t>
+        <w:t xml:space="preserve">Deeper international involvement, at the same time, tends to generate coordination costs and</w:t>
+      </w:r>
+      <w:r>
+        <w:t xml:space="preserve"> </w:t>
+      </w:r>
+      <w:r>
+        <w:t xml:space="preserve">organisational burdens. A firm must manage multiple markets, reconcile diverse customer demands, process more information, and sustain tighter managerial control. As foreign expansion</w:t>
+      </w:r>
+      <w:r>
+        <w:t xml:space="preserve"> </w:t>
+      </w:r>
+      <w:r>
+        <w:t xml:space="preserve">intensifies, these costs may outgrow the benefits, producing diminishing returns or</w:t>
       </w:r>
       <w:r>
         <w:t xml:space="preserve"> </w:t>
@@ -1323,19 +1089,19 @@
         <w:t xml:space="preserve"> </w:t>
       </w:r>
       <w:r>
-        <w:t xml:space="preserve">This argument is especially plausible in Vietnam because firms operate under uneven capability conditions. Some firms may convert foreign expansion into learning and scale advantages,</w:t>
-      </w:r>
-      <w:r>
-        <w:t xml:space="preserve"> </w:t>
-      </w:r>
-      <w:r>
-        <w:t xml:space="preserve">whereas others may encounter organisational strain sooner. The relevant expectation is therefore</w:t>
-      </w:r>
-      <w:r>
-        <w:t xml:space="preserve"> </w:t>
-      </w:r>
-      <w:r>
-        <w:t xml:space="preserve">not a uniformly positive slope, but a nonlinear relationship in which gains from internationalisation become progressively more difficult to sustain.</w:t>
+        <w:t xml:space="preserve">This argument carries particular weight in Vietnam, where firms operate under uneven capability conditions. Some convert foreign expansion into learning and scale advantages;</w:t>
+      </w:r>
+      <w:r>
+        <w:t xml:space="preserve"> </w:t>
+      </w:r>
+      <w:r>
+        <w:t xml:space="preserve">others meet organisational strain sooner. What we expect, then, is</w:t>
+      </w:r>
+      <w:r>
+        <w:t xml:space="preserve"> </w:t>
+      </w:r>
+      <w:r>
+        <w:t xml:space="preserve">not a uniformly positive slope, but a nonlinear relationship in which the gains from internationalisation become progressively harder to sustain.</w:t>
       </w:r>
       <w:r>
         <w:t xml:space="preserve"> </w:t>
@@ -1828,7 +1594,7 @@
         <w:t xml:space="preserve"> </w:t>
       </w:r>
       <w:r>
-        <w:t xml:space="preserve">is reported in 4.5 Panel A as a boundary condition: if direct effects attenuate when innovation</w:t>
+        <w:t xml:space="preserve">is reported in Section 4.5 Panel A as a boundary condition: if direct effects attenuate when innovation</w:t>
       </w:r>
       <w:r>
         <w:t xml:space="preserve"> </w:t>
@@ -2130,7 +1896,7 @@
         </m:sSub>
       </m:oMath>
       <w:r>
-        <w:t xml:space="preserve">) is reported in 4.5 Panel B for the</w:t>
+        <w:t xml:space="preserve">) is reported in Section 4.5 Panel B for the</w:t>
       </w:r>
       <w:r>
         <w:t xml:space="preserve"> </w:t>
@@ -3664,7 +3430,7 @@
         <w:t xml:space="preserve"> </w:t>
       </w:r>
       <w:r>
-        <w:t xml:space="preserve">Two enriched composites are used in the 4.5 robustness panel where item availability allows.</w:t>
+        <w:t xml:space="preserve">Two enriched composites are used in the Section 4.5 robustness panel where item availability allows.</w:t>
       </w:r>
       <w:r>
         <w:t xml:space="preserve"> </w:t>
@@ -6515,7 +6281,7 @@
         <w:t xml:space="preserve"> </w:t>
       </w:r>
       <w:r>
-        <w:t xml:space="preserve">robustness panels described in 4.5. The export step (10) writes the manuscript-facing tables</w:t>
+        <w:t xml:space="preserve">robustness panels described in Section 4.5. The export step (10) writes the manuscript-facing tables</w:t>
       </w:r>
       <w:r>
         <w:t xml:space="preserve"> </w:t>
@@ -9853,7 +9619,7 @@
         <w:t xml:space="preserve"> </w:t>
       </w:r>
       <w:r>
-        <w:t xml:space="preserve">The Paternoster cross-wave z-tests reported in 4.5 confirm that the 2009-to-2015 fall in DAI</w:t>
+        <w:t xml:space="preserve">The Paternoster cross-wave z-tests reported in Section 4.5 confirm that the 2009-to-2015 fall in DAI</w:t>
       </w:r>
       <w:r>
         <w:t xml:space="preserve"> </w:t>
@@ -9873,7 +9639,7 @@
         <w:pStyle w:val="BodyText"/>
       </w:pPr>
       <w:r>
-        <w:t xml:space="preserve">A formal pooled wave × focal interaction test (reported as Panel I in 4.5)</w:t>
+        <w:t xml:space="preserve">A formal pooled wave × focal interaction test (reported as Panel I in Section 4.5)</w:t>
       </w:r>
     </w:p>
     <w:p>
@@ -11641,7 +11407,7 @@
         <w:t xml:space="preserve"> </w:t>
       </w:r>
       <w:r>
-        <w:t xml:space="preserve">per cent (2015) and 46.2 per cent (2009) of direct-export intensity, with the pooled estimate at 39.7 per cent. At the same time, exporter-only models (4.5, Panel H) show</w:t>
+        <w:t xml:space="preserve">per cent (2015) and 46.2 per cent (2009) of direct-export intensity, with the pooled estimate at 39.7 per cent. At the same time, exporter-only models (Section 4.5, Panel H) show</w:t>
       </w:r>
       <w:r>
         <w:t xml:space="preserve"> </w:t>
@@ -11821,7 +11587,7 @@
         <w:t xml:space="preserve"> </w:t>
       </w:r>
       <w:r>
-        <w:t xml:space="preserve">Paternoster cross-wave z-tests (4.5, Panel F) confirm that the 2009-to-2015 fall (z</w:t>
+        <w:t xml:space="preserve">Paternoster cross-wave z-tests (Section 4.5, Panel F) confirm that the 2009-to-2015 fall (z</w:t>
       </w:r>
       <w:r>
         <w:t xml:space="preserve"> </w:t>
@@ -12366,13 +12132,13 @@
         <w:t xml:space="preserve"> </w:t>
       </w:r>
       <w:r>
-        <w:t xml:space="preserve">4.5 density check), and the bulk of mass lies at FSTS = 0. When we re-fit M2 / M7 / M8 on</w:t>
-      </w:r>
-      <w:r>
-        <w:t xml:space="preserve"> </w:t>
-      </w:r>
-      <w:r>
-        <w:t xml:space="preserve">the exporter-only sub-sample (FSTS &gt; 0; pooled N = 669, 4.5 Panel H), the linear</w:t>
+        <w:t xml:space="preserve">Section 4.5 density check), and the bulk of mass lies at FSTS = 0. When we re-fit M2 / M7 / M8 on</w:t>
+      </w:r>
+      <w:r>
+        <w:t xml:space="preserve"> </w:t>
+      </w:r>
+      <w:r>
+        <w:t xml:space="preserve">the exporter-only sub-sample (FSTS &gt; 0; pooled N = 669, Section 4.5 Panel H), the linear</w:t>
       </w:r>
       <w:r>
         <w:t xml:space="preserve"> </w:t>
@@ -12507,13 +12273,13 @@
       </w:r>
     </w:p>
     <w:bookmarkEnd w:id="58"/>
-    <w:bookmarkStart w:id="60" w:name="Xa4c02e0b9d1c1dfbd229ca8e93a765eb24721f0"/>
+    <w:bookmarkStart w:id="60" w:name="section-45-robustness"/>
     <w:p>
       <w:pPr>
         <w:pStyle w:val="Heading3"/>
       </w:pPr>
       <w:r>
-        <w:t xml:space="preserve">4.5 Robustness</w:t>
+        <w:t xml:space="preserve">Section 4.5 Robustness</w:t>
       </w:r>
     </w:p>
     <w:p>
@@ -13942,13 +13708,13 @@
         <w:pStyle w:val="BodyText"/>
       </w:pPr>
       <w:r>
-        <w:t xml:space="preserve">Multiple-testing caveat. 4.5 reports four narrative panels (G, H, I, F) and three robustness families (endogeneity/selection, measurement sensitivity) across multiple focal terms. We do not apply a formal multiple-testing correction because the panels probe different identification concerns rather than testing the same hypothesis repeatedly, but readers should weight any single marginal panel result accordingly. Our substantive inferences in Section 5 rely on the pattern across panels and the directional consistency of the focal estimates rather than on the significance of any single robustness panel.</w:t>
-      </w:r>
-      <w:r>
-        <w:t xml:space="preserve"> </w:t>
-      </w:r>
-      <w:r>
-        <w:t xml:space="preserve">Table 3 collates the robustness panels documented in 4.5 in a single overview to ease crosscomparison.</w:t>
+        <w:t xml:space="preserve">Multiple-testing caveat. Section 4.5 reports four narrative panels (G, H, I, F) and three robustness families (endogeneity/selection, measurement sensitivity) across multiple focal terms. We do not apply a formal multiple-testing correction because the panels probe different identification concerns rather than testing the same hypothesis repeatedly, but readers should weight any single marginal panel result accordingly. Our substantive inferences in Section 5 rely on the pattern across panels and the directional consistency of the focal estimates rather than on the significance of any single robustness panel.</w:t>
+      </w:r>
+      <w:r>
+        <w:t xml:space="preserve"> </w:t>
+      </w:r>
+      <w:r>
+        <w:t xml:space="preserve">Table 3 collates the robustness panels documented in Section 4.5 in a single overview to ease crosscomparison.</w:t>
       </w:r>
       <w:r>
         <w:t xml:space="preserve"> </w:t>
@@ -27106,7 +26872,7 @@
         <w:pStyle w:val="BodyText"/>
       </w:pPr>
       <w:r>
-        <w:t xml:space="preserve">Each row summarises one robustness panel from 4.5 estimated by OLS with HC1 robust standard</w:t>
+        <w:t xml:space="preserve">Each row summarises one robustness panel from Section 4.5 estimated by OLS with HC1 robust standard</w:t>
       </w:r>
       <w:r>
         <w:t xml:space="preserve"> </w:t>
@@ -28262,13 +28028,13 @@
         <w:pStyle w:val="FirstParagraph"/>
       </w:pPr>
       <w:r>
-        <w:t xml:space="preserve">The central implication of the findings is that foundational digital adoption in Vietnam should</w:t>
-      </w:r>
-      <w:r>
-        <w:t xml:space="preserve"> </w:t>
-      </w:r>
-      <w:r>
-        <w:t xml:space="preserve">not be interpreted as a universal and temporally stable productivity premium. Although both</w:t>
+        <w:t xml:space="preserve">The findings carry one central implication: foundational digital adoption in Vietnam should</w:t>
+      </w:r>
+      <w:r>
+        <w:t xml:space="preserve"> </w:t>
+      </w:r>
+      <w:r>
+        <w:t xml:space="preserve">not be read as a universal, temporally stable productivity premium.</w:t>
       </w:r>
       <w:r>
         <w:t xml:space="preserve"> </w:t>
@@ -28340,19 +28106,19 @@
         <w:t xml:space="preserve"> </w:t>
       </w:r>
       <w:r>
-        <w:t xml:space="preserve">are positive on average in pooled specifications, their empirical roles differ</w:t>
-      </w:r>
-      <w:r>
-        <w:t xml:space="preserve"> </w:t>
-      </w:r>
-      <w:r>
-        <w:t xml:space="preserve">materially across waves and across identification strategies (Vahlne, 2020; Stallkamp and Schotter, 2021). This means that website-based digital adoption is not simply a constant background</w:t>
-      </w:r>
-      <w:r>
-        <w:t xml:space="preserve"> </w:t>
-      </w:r>
-      <w:r>
-        <w:t xml:space="preserve">advantage; it is a context-sensitive and stage-dependent source of performance heterogeneity.</w:t>
+        <w:t xml:space="preserve">are both positive on average in the pooled specifications, yet their empirical roles diverge</w:t>
+      </w:r>
+      <w:r>
+        <w:t xml:space="preserve"> </w:t>
+      </w:r>
+      <w:r>
+        <w:t xml:space="preserve">materially across waves and across identification strategies (Vahlne, 2020; Stallkamp and Schotter, 2021). Website-based digital adoption, then, is no constant background</w:t>
+      </w:r>
+      <w:r>
+        <w:t xml:space="preserve"> </w:t>
+      </w:r>
+      <w:r>
+        <w:t xml:space="preserve">advantage; it is a context-sensitive, stage-dependent source of performance heterogeneity.</w:t>
       </w:r>
     </w:p>
     <w:p>
@@ -28446,25 +28212,19 @@
         <w:t xml:space="preserve"> </w:t>
       </w:r>
       <w:r>
-        <w:t xml:space="preserve">This interpretation helps reconcile the coexistence of positive pooled effects and uneven wavespecific results. The pooled model captures the average tendency for stronger capability to be</w:t>
-      </w:r>
-      <w:r>
-        <w:t xml:space="preserve"> </w:t>
-      </w:r>
-      <w:r>
-        <w:t xml:space="preserve">associated with better performance. The wave-specific models show that this tendency is not</w:t>
-      </w:r>
-      <w:r>
-        <w:t xml:space="preserve"> </w:t>
-      </w:r>
-      <w:r>
-        <w:t xml:space="preserve">equally strong in every phase. The value of digital capability therefore depends on where firms</w:t>
-      </w:r>
-      <w:r>
-        <w:t xml:space="preserve"> </w:t>
-      </w:r>
-      <w:r>
-        <w:t xml:space="preserve">stand in the broader lifecycle of internationalisation and transition.</w:t>
+        <w:t xml:space="preserve">This reading helps reconcile the coexistence of positive pooled effects with uneven wave-specific results. The pooled model captures the average tendency for stronger capability to track better performance; the wave-specific models show that this tendency is not</w:t>
+      </w:r>
+      <w:r>
+        <w:t xml:space="preserve"> </w:t>
+      </w:r>
+      <w:r>
+        <w:t xml:space="preserve">equally strong in every phase. The value of digital capability thus depends on where a firm</w:t>
+      </w:r>
+      <w:r>
+        <w:t xml:space="preserve"> </w:t>
+      </w:r>
+      <w:r>
+        <w:t xml:space="preserve">stands in the broader lifecycle of internationalisation and transition.</w:t>
       </w:r>
     </w:p>
     <w:bookmarkEnd w:id="62"/>
@@ -28482,7 +28242,7 @@
         <w:pStyle w:val="FirstParagraph"/>
       </w:pPr>
       <w:r>
-        <w:t xml:space="preserve">The results strengthen the theoretical case for separating foreign-technology / standards capability from foundational digital adoption. The PSM and IV evidence in 4.5 (Panels J and K)</w:t>
+        <w:t xml:space="preserve">The results strengthen the theoretical case for keeping foreign-technology / standards capability apart from foundational digital adoption. The PSM and IV evidence in Section 4.5 (Panels J and K)</w:t>
       </w:r>
       <w:r>
         <w:t xml:space="preserve"> </w:t>
@@ -28634,7 +28394,7 @@
         <w:t xml:space="preserve"> </w:t>
       </w:r>
       <w:r>
-        <w:t xml:space="preserve">extension reported in 4.5 Panel B reinforces the construct interpretation</w:t>
+        <w:t xml:space="preserve">extension reported in Section 4.5 Panel B reinforces the construct interpretation</w:t>
       </w:r>
       <w:r>
         <w:t xml:space="preserve"> </w:t>
@@ -28915,19 +28675,19 @@
         <w:pStyle w:val="BodyText"/>
       </w:pPr>
       <w:r>
-        <w:t xml:space="preserve">supports a more careful approach to digitalisation in international-business research, one that</w:t>
-      </w:r>
-      <w:r>
-        <w:t xml:space="preserve"> </w:t>
-      </w:r>
-      <w:r>
-        <w:t xml:space="preserve">distinguishes between basic digital enablement (easily contaminated by selection on observables)</w:t>
-      </w:r>
-      <w:r>
-        <w:t xml:space="preserve"> </w:t>
-      </w:r>
-      <w:r>
-        <w:t xml:space="preserve">and broader technological depth (more identification-robust), rather than collapsing them into</w:t>
+        <w:t xml:space="preserve">argues for a more careful treatment of digitalisation in international-business research — one that</w:t>
+      </w:r>
+      <w:r>
+        <w:t xml:space="preserve"> </w:t>
+      </w:r>
+      <w:r>
+        <w:t xml:space="preserve">distinguishes basic digital enablement (easily contaminated by selection on observables)</w:t>
+      </w:r>
+      <w:r>
+        <w:t xml:space="preserve"> </w:t>
+      </w:r>
+      <w:r>
+        <w:t xml:space="preserve">from broader technological depth (more identification-robust), rather than collapsing them into</w:t>
       </w:r>
       <w:r>
         <w:t xml:space="preserve"> </w:t>
@@ -29079,7 +28839,7 @@
         <w:t xml:space="preserve"> </w:t>
       </w:r>
       <w:r>
-        <w:t xml:space="preserve">contingency rather than as a fully cross-wave-identified structural shift. As reported in 4.5 Panel</w:t>
+        <w:t xml:space="preserve">contingency rather than as a fully cross-wave-identified structural shift. As reported in Section 4.5 Panel</w:t>
       </w:r>
       <w:r>
         <w:t xml:space="preserve"> </w:t>
@@ -29351,7 +29111,7 @@
         <w:pStyle w:val="FirstParagraph"/>
       </w:pPr>
       <w:r>
-        <w:t xml:space="preserve">We frame the policy reading as tentative considerations rather than directive prescriptions. The</w:t>
+        <w:t xml:space="preserve">The policy reading here is offered as tentative consideration, not directive prescription. The</w:t>
       </w:r>
       <w:r>
         <w:t xml:space="preserve"> </w:t>
@@ -29363,7 +29123,7 @@
         <w:t xml:space="preserve"> </w:t>
       </w:r>
       <w:r>
-        <w:t xml:space="preserve">single-economy scope all weigh against converting the findings into firm policy targets. With</w:t>
+        <w:t xml:space="preserve">single-economy scope all weigh against converting these findings into firm policy targets. With</w:t>
       </w:r>
       <w:r>
         <w:t xml:space="preserve"> </w:t>
@@ -29500,19 +29260,19 @@
         <w:pStyle w:val="FirstParagraph"/>
       </w:pPr>
       <w:r>
-        <w:t xml:space="preserve">The findings should be read against five limitations. First and most fundamentally, the WBES</w:t>
-      </w:r>
-      <w:r>
-        <w:t xml:space="preserve"> </w:t>
-      </w:r>
-      <w:r>
-        <w:t xml:space="preserve">microdata are repeated cross-sections rather than a true firm panel. Within-firm change over</w:t>
-      </w:r>
-      <w:r>
-        <w:t xml:space="preserve"> </w:t>
-      </w:r>
-      <w:r>
-        <w:t xml:space="preserve">time cannot be identified, and time-invariant unobserved heterogeneity cannot be netted out at</w:t>
+        <w:t xml:space="preserve">The findings should be read against five limitations. The first and most fundamental is that the WBES</w:t>
+      </w:r>
+      <w:r>
+        <w:t xml:space="preserve"> </w:t>
+      </w:r>
+      <w:r>
+        <w:t xml:space="preserve">microdata are repeated cross-sections, not a true firm panel. Within-firm change over</w:t>
+      </w:r>
+      <w:r>
+        <w:t xml:space="preserve"> </w:t>
+      </w:r>
+      <w:r>
+        <w:t xml:space="preserve">time cannot be identified, nor can time-invariant unobserved heterogeneity be netted out at</w:t>
       </w:r>
       <w:r>
         <w:t xml:space="preserve"> </w:t>
@@ -29668,23 +29428,7 @@
         <w:t xml:space="preserve"> </w:t>
       </w:r>
       <w:r>
-        <w:t xml:space="preserve">Fourth, the cross-wave evidence is uneven in statistical strength.</w:t>
-      </w:r>
-    </w:p>
-    <w:p>
-      <w:pPr>
-        <w:pStyle w:val="BodyText"/>
-      </w:pPr>
-      <w:r>
-        <w:t xml:space="preserve">The Paternoster et al.</w:t>
-      </w:r>
-    </w:p>
-    <w:p>
-      <w:pPr>
-        <w:pStyle w:val="BodyText"/>
-      </w:pPr>
-      <w:r>
-        <w:t xml:space="preserve">(1998) z-tests confirm that the drop in</w:t>
+        <w:t xml:space="preserve">Fourth, the cross-wave evidence is uneven in statistical strength. The Paternoster et al. (1998) z-tests confirm that the drop in</w:t>
       </w:r>
       <w:r>
         <w:t xml:space="preserve"> </w:t>
@@ -29762,29 +29506,7 @@
         <w:t xml:space="preserve"> </w:t>
       </w:r>
       <w:r>
-        <w:t xml:space="preserve">Fifth, the sector fixed effects in the main models are intentionally broad to keep the crosswave specification comparable.</w:t>
-      </w:r>
-    </w:p>
-    <w:p>
-      <w:pPr>
-        <w:pStyle w:val="BodyText"/>
-      </w:pPr>
-      <w:r>
-        <w:t xml:space="preserve">Section 4.5 Panel G addresses one natural extension by re-</w:t>
-      </w:r>
-    </w:p>
-    <w:p>
-      <w:pPr>
-        <w:pStyle w:val="BodyText"/>
-      </w:pPr>
-      <w:r>
-        <w:t xml:space="preserve">estimating the pooled M2 / M7 / M8 specifications on manufacturing (sector1 ∈ {1, 2, 3}; N =</w:t>
-      </w:r>
-      <w:r>
-        <w:t xml:space="preserve"> </w:t>
-      </w:r>
-      <w:r>
-        <w:t xml:space="preserve">1,854) versus non-manufacturing (sector1 ∈ {4, 5, 6, 7}; N = 1,104) subsets, and shows that the</w:t>
+        <w:t xml:space="preserve">Fifth, the sector fixed effects in the main models are intentionally broad to keep the crosswave specification comparable. Section 4.5 Panel G addresses one natural extension by re-estimating the pooled M2 / M7 / M8 specifications on manufacturing (sector1 ∈ {1, 2, 3}; N = 1,854) versus non-manufacturing (sector1 ∈ {4, 5, 6, 7}; N = 1,104) subsets, and shows that the</w:t>
       </w:r>
       <w:r>
         <w:t xml:space="preserve"> </w:t>
@@ -29840,7 +29562,7 @@
         <w:pStyle w:val="FirstParagraph"/>
       </w:pPr>
       <w:r>
-        <w:t xml:space="preserve">This study revisits the internationalisation–performance relationship in Vietnam by distinguishing foreign-technology / standards capability from foundational digital adoption and by comparing pooled with wave-specific evidence.</w:t>
+        <w:t xml:space="preserve">This study revisits the internationalisation–performance relationship in Vietnam, distinguishing foreign-technology / standards capability from foundational digital adoption and comparing pooled with wave-specific evidence.</w:t>
       </w:r>
     </w:p>
     <w:p>
@@ -29868,13 +29590,13 @@
         <w:t xml:space="preserve"> </w:t>
       </w:r>
       <w:r>
-        <w:t xml:space="preserve">The results also show that the two capability domains should not be treated as interchangeable. Technological capability is comparatively stable and identification-robust across specifications, whereas foundational digital adoption is more wave-sensitive and only exhibits withinsample detectable moderation in 2023. The broader implication is that the productivity relevance</w:t>
-      </w:r>
-      <w:r>
-        <w:t xml:space="preserve"> </w:t>
-      </w:r>
-      <w:r>
-        <w:t xml:space="preserve">of basic digital adoption in a transitional economy is real but uneven, and that pooled averages</w:t>
+        <w:t xml:space="preserve">The results also show that the two capability domains are not interchangeable. Technological capability is comparatively stable and identification-robust across specifications, whereas foundational digital adoption is more wave-sensitive and shows within-sample detectable moderation only in 2023. The broader implication follows: in a transitional economy the productivity relevance</w:t>
+      </w:r>
+      <w:r>
+        <w:t xml:space="preserve"> </w:t>
+      </w:r>
+      <w:r>
+        <w:t xml:space="preserve">of basic digital adoption is real but uneven, and pooled averages</w:t>
       </w:r>
       <w:r>
         <w:t xml:space="preserve"> </w:t>

</xml_diff>